<commit_message>
Phase 2C: MRA revisions and SED memos as PDF (WeasyPrint); SoT v1.6 locked
- MRA built from header, references, confirmed package counts per warehouse, SED summary and
  unloading position; no SKU detail of the consignment and no unloading rate; operating CFA
  effective on the arrival date, seal block "For RAINBOW LOGISTICS, CFA - ..."
- One PDF: driver copy, depot copy, then Short / Excess / Damage memos for the System Supervisor
  (LSCRR-covered / Excess Receipt for Direct Factory LSCRR Ships, otherwise issue TRX / receipt TRX /
  transfer to DMG; outbound has no memos)
- Revisions R01, R02 ... frozen; re-issued only when the content changed, with a reason
- Blockers: verification confirmed, package counts saved, unloading recorded, SED values entered
- Every view / PDF print is audit-logged; deploy installs the Pango libraries for WeasyPrint
- Stock Inward Process SoT v1.6 approved and locked (16-Oct-2026)

Co-Authored-By: Claude Opus 5.5 <noreply@anthropic.com>
</commit_message>
<xml_diff>
--- a/Stock_Inward_Process_Source_of_Truth_v1.6.docx
+++ b/Stock_Inward_Process_Source_of_Truth_v1.6.docx
@@ -35,7 +35,7 @@
         <w:rPr>
           <w:sz w:val="21"/>
         </w:rPr>
-        <w:t>Python + Django | Coimbatore Depot 035 · operated by RAINBOW LOGISTICS (CFA) | Version 1.6 - Draft for approval | 16 October 2026</w:t>
+        <w:t>Python + Django | Coimbatore Depot 035 · operated by RAINBOW LOGISTICS (CFA) | Version 1.6 - Locked Baseline | 16 October 2026</w:t>
       </w:r>
     </w:p>
     <w:tbl>
@@ -55,7 +55,7 @@
           </w:tcPr>
           <w:p>
             <w:r>
-              <w:t>STATUS: DRAFT v1.6 FOR APPROVAL. On approval it supersedes v1.5 and becomes the locked baseline. v1.6 = v1.5 plus the decisions taken during the Phase 0 / Phase 1 build (15-16 Oct-2026): SIT fetched by a button (no schedule), the real SIT mail subject and format, native server install with DNS in Cloudflare, outbound tick-and-tally with three row sources, clerk-chosen warehouse for vendor challans, and the SKU packaging master rules. Coding agents must not silently change business rules, workflow gates, reconciliation logic, document requirements or notification routing; any ambiguity is raised as a decision point.</w:t>
+              <w:t>STATUS: LOCKED BASELINE v1.6 (approved 16-Oct-2026). Supersedes v1.5. v1.6 = v1.5 plus the decisions taken during the Phase 0 / Phase 1 build (15-16 Oct-2026): SIT fetched by a button (no schedule), the real SIT mail subject and format, native server install with DNS in Cloudflare, outbound tick-and-tally with three row sources, clerk-chosen warehouse for vendor challans, and the SKU packaging master rules. Coding agents must not silently change business rules, workflow gates, reconciliation logic, document requirements or notification routing; any ambiguity is raised as a decision point.</w:t>
             </w:r>
           </w:p>
         </w:tc>
@@ -12593,7 +12593,7 @@
           </w:tcPr>
           <w:p>
             <w:r>
-              <w:t>DRAFT FOR APPROVAL</w:t>
+              <w:t>LOCKED BASELINE</w:t>
             </w:r>
           </w:p>
         </w:tc>

</xml_diff>